<commit_message>
Mettre à jour la documentation (v2.0) : intègre le portage SharePoint (SPFx)
Guide utilisateur : nouvelle section « Démarrer via SharePoint », dépannage mis à jour
(erreur transitoire au premier chargement, tuile inerte dans Contenu du site).
Spécifications techniques : nouvelle section 10 (architecture SPFx, auto-provisionnement,
contraintes ES5, sécurité OData), description corrigée du parseur Excel réel (multi-onglets,
en-têtes multi-lignes), section sécurité réseau/HTTPS.
Cahier des charges : périmètre étendu aux deux modes de déploiement (exécutable + SharePoint),
contraintes et exigences non fonctionnelles mises à jour, historique des versions ajouté.

Co-Authored-By: Claude Sonnet 5 <noreply@anthropic.com>
Claude-Session: https://claude.ai/code/session_0113CmawCQ8ndT6FVRE1Zfqq
</commit_message>
<xml_diff>
--- a/docs/Cahier-des-charges.docx
+++ b/docs/Cahier-des-charges.docx
@@ -132,7 +132,7 @@
           <w:sz w:val="22"/>
           <w:szCs w:val="22"/>
         </w:rPr>
-        <w:t xml:space="preserve">1.0</w:t>
+        <w:t xml:space="preserve">2.0</w:t>
       </w:r>
     </w:p>
     <w:p>
@@ -155,7 +155,7 @@
           <w:sz w:val="22"/>
           <w:szCs w:val="22"/>
         </w:rPr>
-        <w:t xml:space="preserve">Application existante — document de référence du périmètre livré</w:t>
+        <w:t xml:space="preserve">Application existante — document de référence du périmètre livré, deux modes de déploiement</w:t>
       </w:r>
     </w:p>
     <w:p>
@@ -319,6 +319,24 @@
     </w:p>
     <w:p>
       <w:pPr>
+        <w:pStyle w:val="ListParagraph"/>
+        <w:numPr>
+          <w:ilvl w:val="0"/>
+          <w:numId w:val="2"/>
+        </w:numPr>
+        <w:spacing w:after="80"/>
+      </w:pPr>
+      <w:r>
+        <w:rPr>
+          <w:color w:val="000000"/>
+          <w:sz w:val="21"/>
+          <w:szCs w:val="21"/>
+        </w:rPr>
+        <w:t xml:space="preserve">Permettre également un accès partagé, sans installation sur le poste, via intégration dans l'environnement collaboratif existant (SharePoint Online) pour les équipes qui le souhaitent.</w:t>
+      </w:r>
+    </w:p>
+    <w:p>
+      <w:pPr>
         <w:pStyle w:val="Heading1"/>
         <w:pBdr>
           <w:bottom w:val="single" w:color="00874C" w:sz="8" w:space="4"/>
@@ -336,6 +354,286 @@
         <w:t xml:space="preserve">2. Périmètre fonctionnel</w:t>
       </w:r>
     </w:p>
+    <w:p>
+      <w:pPr>
+        <w:spacing w:after="160"/>
+      </w:pPr>
+      <w:r>
+        <w:rPr>
+          <w:color w:val="000000"/>
+          <w:sz w:val="21"/>
+          <w:szCs w:val="21"/>
+        </w:rPr>
+        <w:t xml:space="preserve">L'application existe sous deux formes de déploiement au fonctionnel strictement identique (mêmes trois modules, mêmes règles métier) — seul le mode d'accès et de stockage des données diffère (voir spécifications techniques) :</w:t>
+      </w:r>
+    </w:p>
+    <w:tbl>
+      <w:tblPr>
+        <w:tblW w:type="dxa" w:w="10000"/>
+        <w:tblBorders>
+          <w:top w:val="single" w:color="DDE1E6" w:sz="4"/>
+          <w:left w:val="single" w:color="DDE1E6" w:sz="4"/>
+          <w:bottom w:val="single" w:color="DDE1E6" w:sz="4"/>
+          <w:right w:val="single" w:color="DDE1E6" w:sz="4"/>
+          <w:insideH w:val="single" w:color="DDE1E6" w:sz="4"/>
+          <w:insideV w:val="single" w:color="DDE1E6" w:sz="4"/>
+        </w:tblBorders>
+      </w:tblPr>
+      <w:tblGrid>
+        <w:gridCol w:w="3400"/>
+        <w:gridCol w:w="3300"/>
+        <w:gridCol w:w="3300"/>
+      </w:tblGrid>
+      <w:tr>
+        <w:trPr>
+          <w:tblHeader/>
+        </w:trPr>
+        <w:tc>
+          <w:tcPr>
+            <w:tcW w:type="dxa" w:w="3400"/>
+            <w:shd w:fill="00874C" w:val="clear"/>
+            <w:tcMar>
+              <w:top w:type="dxa" w:w="80"/>
+              <w:left w:type="dxa" w:w="100"/>
+              <w:bottom w:type="dxa" w:w="80"/>
+              <w:right w:type="dxa" w:w="100"/>
+            </w:tcMar>
+          </w:tcPr>
+          <w:p>
+            <w:pPr>
+              <w:jc w:val="left"/>
+            </w:pPr>
+            <w:r>
+              <w:rPr>
+                <w:b/>
+                <w:bCs/>
+                <w:color w:val="FFFFFF"/>
+                <w:sz w:val="20"/>
+                <w:szCs w:val="20"/>
+              </w:rPr>
+              <w:t xml:space="preserve">Mode</w:t>
+            </w:r>
+          </w:p>
+        </w:tc>
+        <w:tc>
+          <w:tcPr>
+            <w:tcW w:type="dxa" w:w="3300"/>
+            <w:shd w:fill="00874C" w:val="clear"/>
+            <w:tcMar>
+              <w:top w:type="dxa" w:w="80"/>
+              <w:left w:type="dxa" w:w="100"/>
+              <w:bottom w:type="dxa" w:w="80"/>
+              <w:right w:type="dxa" w:w="100"/>
+            </w:tcMar>
+          </w:tcPr>
+          <w:p>
+            <w:pPr>
+              <w:jc w:val="left"/>
+            </w:pPr>
+            <w:r>
+              <w:rPr>
+                <w:b/>
+                <w:bCs/>
+                <w:color w:val="FFFFFF"/>
+                <w:sz w:val="20"/>
+                <w:szCs w:val="20"/>
+              </w:rPr>
+              <w:t xml:space="preserve">Accès</w:t>
+            </w:r>
+          </w:p>
+        </w:tc>
+        <w:tc>
+          <w:tcPr>
+            <w:tcW w:type="dxa" w:w="3300"/>
+            <w:shd w:fill="00874C" w:val="clear"/>
+            <w:tcMar>
+              <w:top w:type="dxa" w:w="80"/>
+              <w:left w:type="dxa" w:w="100"/>
+              <w:bottom w:type="dxa" w:w="80"/>
+              <w:right w:type="dxa" w:w="100"/>
+            </w:tcMar>
+          </w:tcPr>
+          <w:p>
+            <w:pPr>
+              <w:jc w:val="left"/>
+            </w:pPr>
+            <w:r>
+              <w:rPr>
+                <w:b/>
+                <w:bCs/>
+                <w:color w:val="FFFFFF"/>
+                <w:sz w:val="20"/>
+                <w:szCs w:val="20"/>
+              </w:rPr>
+              <w:t xml:space="preserve">Stockage des données</w:t>
+            </w:r>
+          </w:p>
+        </w:tc>
+      </w:tr>
+      <w:tr>
+        <w:tc>
+          <w:tcPr>
+            <w:tcW w:type="dxa" w:w="3400"/>
+            <w:tcMar>
+              <w:top w:type="dxa" w:w="80"/>
+              <w:left w:type="dxa" w:w="100"/>
+              <w:bottom w:type="dxa" w:w="80"/>
+              <w:right w:type="dxa" w:w="100"/>
+            </w:tcMar>
+          </w:tcPr>
+          <w:p>
+            <w:pPr>
+              <w:jc w:val="left"/>
+            </w:pPr>
+            <w:r>
+              <w:rPr>
+                <w:b w:val="false"/>
+                <w:bCs w:val="false"/>
+                <w:color w:val="000000"/>
+                <w:sz w:val="20"/>
+                <w:szCs w:val="20"/>
+              </w:rPr>
+              <w:t xml:space="preserve">Exécutable Windows autonome</w:t>
+            </w:r>
+          </w:p>
+        </w:tc>
+        <w:tc>
+          <w:tcPr>
+            <w:tcW w:type="dxa" w:w="3300"/>
+            <w:tcMar>
+              <w:top w:type="dxa" w:w="80"/>
+              <w:left w:type="dxa" w:w="100"/>
+              <w:bottom w:type="dxa" w:w="80"/>
+              <w:right w:type="dxa" w:w="100"/>
+            </w:tcMar>
+          </w:tcPr>
+          <w:p>
+            <w:pPr>
+              <w:jc w:val="left"/>
+            </w:pPr>
+            <w:r>
+              <w:rPr>
+                <w:b w:val="false"/>
+                <w:bCs w:val="false"/>
+                <w:color w:val="000000"/>
+                <w:sz w:val="20"/>
+                <w:szCs w:val="20"/>
+              </w:rPr>
+              <w:t xml:space="preserve">Double-clic sur un poste dédié, hors ligne</w:t>
+            </w:r>
+          </w:p>
+        </w:tc>
+        <w:tc>
+          <w:tcPr>
+            <w:tcW w:type="dxa" w:w="3300"/>
+            <w:tcMar>
+              <w:top w:type="dxa" w:w="80"/>
+              <w:left w:type="dxa" w:w="100"/>
+              <w:bottom w:type="dxa" w:w="80"/>
+              <w:right w:type="dxa" w:w="100"/>
+            </w:tcMar>
+          </w:tcPr>
+          <w:p>
+            <w:pPr>
+              <w:jc w:val="left"/>
+            </w:pPr>
+            <w:r>
+              <w:rPr>
+                <w:b w:val="false"/>
+                <w:bCs w:val="false"/>
+                <w:color w:val="000000"/>
+                <w:sz w:val="20"/>
+                <w:szCs w:val="20"/>
+              </w:rPr>
+              <w:t xml:space="preserve">Fichiers JSON + fichiers déposés, à côté de l'exécutable</w:t>
+            </w:r>
+          </w:p>
+        </w:tc>
+      </w:tr>
+      <w:tr>
+        <w:tc>
+          <w:tcPr>
+            <w:tcW w:type="dxa" w:w="3400"/>
+            <w:shd w:fill="F5F6F8" w:val="clear"/>
+            <w:tcMar>
+              <w:top w:type="dxa" w:w="80"/>
+              <w:left w:type="dxa" w:w="100"/>
+              <w:bottom w:type="dxa" w:w="80"/>
+              <w:right w:type="dxa" w:w="100"/>
+            </w:tcMar>
+          </w:tcPr>
+          <w:p>
+            <w:pPr>
+              <w:jc w:val="left"/>
+            </w:pPr>
+            <w:r>
+              <w:rPr>
+                <w:b w:val="false"/>
+                <w:bCs w:val="false"/>
+                <w:color w:val="000000"/>
+                <w:sz w:val="20"/>
+                <w:szCs w:val="20"/>
+              </w:rPr>
+              <w:t xml:space="preserve">Web part SharePoint Online (SPFx)</w:t>
+            </w:r>
+          </w:p>
+        </w:tc>
+        <w:tc>
+          <w:tcPr>
+            <w:tcW w:type="dxa" w:w="3300"/>
+            <w:shd w:fill="F5F6F8" w:val="clear"/>
+            <w:tcMar>
+              <w:top w:type="dxa" w:w="80"/>
+              <w:left w:type="dxa" w:w="100"/>
+              <w:bottom w:type="dxa" w:w="80"/>
+              <w:right w:type="dxa" w:w="100"/>
+            </w:tcMar>
+          </w:tcPr>
+          <w:p>
+            <w:pPr>
+              <w:jc w:val="left"/>
+            </w:pPr>
+            <w:r>
+              <w:rPr>
+                <w:b w:val="false"/>
+                <w:bCs w:val="false"/>
+                <w:color w:val="000000"/>
+                <w:sz w:val="20"/>
+                <w:szCs w:val="20"/>
+              </w:rPr>
+              <w:t xml:space="preserve">Page d'un site SharePoint, navigateur, sans installation</w:t>
+            </w:r>
+          </w:p>
+        </w:tc>
+        <w:tc>
+          <w:tcPr>
+            <w:tcW w:type="dxa" w:w="3300"/>
+            <w:shd w:fill="F5F6F8" w:val="clear"/>
+            <w:tcMar>
+              <w:top w:type="dxa" w:w="80"/>
+              <w:left w:type="dxa" w:w="100"/>
+              <w:bottom w:type="dxa" w:w="80"/>
+              <w:right w:type="dxa" w:w="100"/>
+            </w:tcMar>
+          </w:tcPr>
+          <w:p>
+            <w:pPr>
+              <w:jc w:val="left"/>
+            </w:pPr>
+            <w:r>
+              <w:rPr>
+                <w:b w:val="false"/>
+                <w:bCs w:val="false"/>
+                <w:color w:val="000000"/>
+                <w:sz w:val="20"/>
+                <w:szCs w:val="20"/>
+              </w:rPr>
+              <w:t xml:space="preserve">Listes et bibliothèques SharePoint du site, provisionnées automatiquement au premier chargement</w:t>
+            </w:r>
+          </w:p>
+        </w:tc>
+      </w:tr>
+    </w:tbl>
     <w:p>
       <w:pPr>
         <w:pStyle w:val="Heading2"/>
@@ -461,7 +759,7 @@
           <w:sz w:val="21"/>
           <w:szCs w:val="21"/>
         </w:rPr>
-        <w:t xml:space="preserve">Gestion des utilisateurs, authentification, droits d'accès différenciés.</w:t>
+        <w:t xml:space="preserve">Gestion des utilisateurs, authentification, droits d'accès différenciés spécifiques à l'application (la version SharePoint hérite des permissions standard du site, mais l'application elle-même ne gère aucun compte).</w:t>
       </w:r>
     </w:p>
     <w:p>
@@ -497,7 +795,7 @@
           <w:sz w:val="21"/>
           <w:szCs w:val="21"/>
         </w:rPr>
-        <w:t xml:space="preserve">Envoi automatique du contrat par e-mail ou dépôt vers un espace partagé (SharePoint, etc.).</w:t>
+        <w:t xml:space="preserve">Envoi automatique du contrat par e-mail.</w:t>
       </w:r>
     </w:p>
     <w:p>
@@ -533,7 +831,25 @@
           <w:sz w:val="21"/>
           <w:szCs w:val="21"/>
         </w:rPr>
-        <w:t xml:space="preserve">Accès multi-postes simultané avec synchronisation temps réel des données entre plusieurs instances de l'application.</w:t>
+        <w:t xml:space="preserve">Synchronisation ou fusion des données entre une instance exécutable et une instance SharePoint : ce sont deux jeux de données indépendants, sans passerelle automatique de l'un vers l'autre.</w:t>
+      </w:r>
+    </w:p>
+    <w:p>
+      <w:pPr>
+        <w:pStyle w:val="ListParagraph"/>
+        <w:numPr>
+          <w:ilvl w:val="0"/>
+          <w:numId w:val="2"/>
+        </w:numPr>
+        <w:spacing w:after="80"/>
+      </w:pPr>
+      <w:r>
+        <w:rPr>
+          <w:color w:val="000000"/>
+          <w:sz w:val="21"/>
+          <w:szCs w:val="21"/>
+        </w:rPr>
+        <w:t xml:space="preserve">Publication de l'application comme onglet Microsoft Teams : le web part est techniquement compatible (manifeste SPFx), mais ce circuit de déploiement (validation des applications tierces dans le centre d'administration Teams) n'a pas été mis en œuvre.</w:t>
       </w:r>
     </w:p>
     <w:p>
@@ -564,7 +880,7 @@
           <w:sz w:val="20"/>
           <w:szCs w:val="20"/>
         </w:rPr>
-        <w:t xml:space="preserve">Ce périmètre correspond à l'application telle que livrée. Toute évolution vers l'un des points ci-dessus constitue une nouvelle demande, à cadrer séparément (impact potentiel sur l'architecture — voir les spécifications techniques, notamment l'absence d'authentification et la persistance par fichiers JSON).</w:t>
+        <w:t xml:space="preserve">Ce périmètre correspond à l'application telle que livrée, dans ses deux modes de déploiement. Toute évolution vers l'un des points ci-dessus constitue une nouvelle demande, à cadrer séparément (impact potentiel sur l'architecture — voir les spécifications techniques).</w:t>
       </w:r>
     </w:p>
     <w:p>
@@ -2702,7 +3018,7 @@
                 <w:sz w:val="20"/>
                 <w:szCs w:val="20"/>
               </w:rPr>
-              <w:t xml:space="preserve">Démarrage en un double-clic, sans commande à taper ; ouverture automatique du navigateur sur l'application.</w:t>
+              <w:t xml:space="preserve">Démarrage en un double-clic (exécutable), sans commande à taper ; ouverture automatique du navigateur. Sur SharePoint, ajout du composant sur une page comme n'importe quel autre web part.</w:t>
             </w:r>
           </w:p>
         </w:tc>
@@ -2786,6 +3102,169 @@
                 <w:szCs w:val="20"/>
               </w:rPr>
               <w:t xml:space="preserve">Interface et messages entièrement en français.</w:t>
+            </w:r>
+          </w:p>
+        </w:tc>
+      </w:tr>
+      <w:tr>
+        <w:tc>
+          <w:tcPr>
+            <w:tcW w:type="dxa" w:w="1400"/>
+            <w:tcMar>
+              <w:top w:type="dxa" w:w="80"/>
+              <w:left w:type="dxa" w:w="100"/>
+              <w:bottom w:type="dxa" w:w="80"/>
+              <w:right w:type="dxa" w:w="100"/>
+            </w:tcMar>
+          </w:tcPr>
+          <w:p>
+            <w:pPr>
+              <w:jc w:val="left"/>
+            </w:pPr>
+            <w:r>
+              <w:rPr>
+                <w:b w:val="false"/>
+                <w:bCs w:val="false"/>
+                <w:color w:val="000000"/>
+                <w:sz w:val="20"/>
+                <w:szCs w:val="20"/>
+              </w:rPr>
+              <w:t xml:space="preserve">ENF-09</w:t>
+            </w:r>
+          </w:p>
+        </w:tc>
+        <w:tc>
+          <w:tcPr>
+            <w:tcW w:type="dxa" w:w="2400"/>
+            <w:tcMar>
+              <w:top w:type="dxa" w:w="80"/>
+              <w:left w:type="dxa" w:w="100"/>
+              <w:bottom w:type="dxa" w:w="80"/>
+              <w:right w:type="dxa" w:w="100"/>
+            </w:tcMar>
+          </w:tcPr>
+          <w:p>
+            <w:pPr>
+              <w:jc w:val="left"/>
+            </w:pPr>
+            <w:r>
+              <w:rPr>
+                <w:b w:val="false"/>
+                <w:bCs w:val="false"/>
+                <w:color w:val="000000"/>
+                <w:sz w:val="20"/>
+                <w:szCs w:val="20"/>
+              </w:rPr>
+              <w:t xml:space="preserve">Sécurité réseau (exécutable)</w:t>
+            </w:r>
+          </w:p>
+        </w:tc>
+        <w:tc>
+          <w:tcPr>
+            <w:tcW w:type="dxa" w:w="6200"/>
+            <w:tcMar>
+              <w:top w:type="dxa" w:w="80"/>
+              <w:left w:type="dxa" w:w="100"/>
+              <w:bottom w:type="dxa" w:w="80"/>
+              <w:right w:type="dxa" w:w="100"/>
+            </w:tcMar>
+          </w:tcPr>
+          <w:p>
+            <w:pPr>
+              <w:jc w:val="left"/>
+            </w:pPr>
+            <w:r>
+              <w:rPr>
+                <w:b w:val="false"/>
+                <w:bCs w:val="false"/>
+                <w:color w:val="000000"/>
+                <w:sz w:val="20"/>
+                <w:szCs w:val="20"/>
+              </w:rPr>
+              <w:t xml:space="preserve">Le serveur local n'écoute que sur l'interface locale de la machine (127.0.0.1) par défaut ; aucune autre machine du réseau ne peut y accéder sans configuration explicite.</w:t>
+            </w:r>
+          </w:p>
+        </w:tc>
+      </w:tr>
+      <w:tr>
+        <w:tc>
+          <w:tcPr>
+            <w:tcW w:type="dxa" w:w="1400"/>
+            <w:shd w:fill="F5F6F8" w:val="clear"/>
+            <w:tcMar>
+              <w:top w:type="dxa" w:w="80"/>
+              <w:left w:type="dxa" w:w="100"/>
+              <w:bottom w:type="dxa" w:w="80"/>
+              <w:right w:type="dxa" w:w="100"/>
+            </w:tcMar>
+          </w:tcPr>
+          <w:p>
+            <w:pPr>
+              <w:jc w:val="left"/>
+            </w:pPr>
+            <w:r>
+              <w:rPr>
+                <w:b w:val="false"/>
+                <w:bCs w:val="false"/>
+                <w:color w:val="000000"/>
+                <w:sz w:val="20"/>
+                <w:szCs w:val="20"/>
+              </w:rPr>
+              <w:t xml:space="preserve">ENF-10</w:t>
+            </w:r>
+          </w:p>
+        </w:tc>
+        <w:tc>
+          <w:tcPr>
+            <w:tcW w:type="dxa" w:w="2400"/>
+            <w:shd w:fill="F5F6F8" w:val="clear"/>
+            <w:tcMar>
+              <w:top w:type="dxa" w:w="80"/>
+              <w:left w:type="dxa" w:w="100"/>
+              <w:bottom w:type="dxa" w:w="80"/>
+              <w:right w:type="dxa" w:w="100"/>
+            </w:tcMar>
+          </w:tcPr>
+          <w:p>
+            <w:pPr>
+              <w:jc w:val="left"/>
+            </w:pPr>
+            <w:r>
+              <w:rPr>
+                <w:b w:val="false"/>
+                <w:bCs w:val="false"/>
+                <w:color w:val="000000"/>
+                <w:sz w:val="20"/>
+                <w:szCs w:val="20"/>
+              </w:rPr>
+              <w:t xml:space="preserve">Auto-provisionnement (SharePoint)</w:t>
+            </w:r>
+          </w:p>
+        </w:tc>
+        <w:tc>
+          <w:tcPr>
+            <w:tcW w:type="dxa" w:w="6200"/>
+            <w:shd w:fill="F5F6F8" w:val="clear"/>
+            <w:tcMar>
+              <w:top w:type="dxa" w:w="80"/>
+              <w:left w:type="dxa" w:w="100"/>
+              <w:bottom w:type="dxa" w:w="80"/>
+              <w:right w:type="dxa" w:w="100"/>
+            </w:tcMar>
+          </w:tcPr>
+          <w:p>
+            <w:pPr>
+              <w:jc w:val="left"/>
+            </w:pPr>
+            <w:r>
+              <w:rPr>
+                <w:b w:val="false"/>
+                <w:bCs w:val="false"/>
+                <w:color w:val="000000"/>
+                <w:sz w:val="20"/>
+                <w:szCs w:val="20"/>
+              </w:rPr>
+              <w:t xml:space="preserve">La version SharePoint crée elle-même les listes et bibliothèques dont elle a besoin au premier chargement, sans étape d'installation manuelle par un administrateur du site.</w:t>
             </w:r>
           </w:p>
         </w:tc>
@@ -2808,6 +3287,22 @@
           <w:szCs w:val="32"/>
         </w:rPr>
         <w:t xml:space="preserve">5. Contraintes</w:t>
+      </w:r>
+    </w:p>
+    <w:p>
+      <w:pPr>
+        <w:pStyle w:val="Heading2"/>
+        <w:spacing w:after="160" w:before="360"/>
+      </w:pPr>
+      <w:r>
+        <w:rPr>
+          <w:b/>
+          <w:bCs/>
+          <w:color w:val="000000"/>
+          <w:sz w:val="26"/>
+          <w:szCs w:val="26"/>
+        </w:rPr>
+        <w:t xml:space="preserve">5.1. Exécutable Windows</w:t>
       </w:r>
     </w:p>
     <w:p>
@@ -2861,7 +3356,23 @@
           <w:sz w:val="21"/>
           <w:szCs w:val="21"/>
         </w:rPr>
-        <w:t xml:space="preserve">Le fichier de conditions commerciales doit présenter ses en-têtes de colonnes sur la première ligne de la première feuille du classeur.</w:t>
+        <w:t xml:space="preserve">Aucune connexion réseau externe requise pour fonctionner (usage entièrement local).</w:t>
+      </w:r>
+    </w:p>
+    <w:p>
+      <w:pPr>
+        <w:pStyle w:val="Heading2"/>
+        <w:spacing w:after="160" w:before="360"/>
+      </w:pPr>
+      <w:r>
+        <w:rPr>
+          <w:b/>
+          <w:bCs/>
+          <w:color w:val="000000"/>
+          <w:sz w:val="26"/>
+          <w:szCs w:val="26"/>
+        </w:rPr>
+        <w:t xml:space="preserve">5.2. Web part SharePoint</w:t>
       </w:r>
     </w:p>
     <w:p>
@@ -2879,7 +3390,7 @@
           <w:sz w:val="21"/>
           <w:szCs w:val="21"/>
         </w:rPr>
-        <w:t xml:space="preserve">Les templates de contrat doivent être au format .docx, avec les emplacements à remplir balisés {{Nom de variable}}.</w:t>
+        <w:t xml:space="preserve">Site cible : SharePoint Online, avec le paquet applicatif (.sppkg) déposé dans le catalogue d'applications du tenant.</w:t>
       </w:r>
     </w:p>
     <w:p>
@@ -2897,7 +3408,77 @@
           <w:sz w:val="21"/>
           <w:szCs w:val="21"/>
         </w:rPr>
-        <w:t xml:space="preserve">Aucune connexion réseau externe requise pour fonctionner (usage entièrement local).</w:t>
+        <w:t xml:space="preserve">La première personne qui ouvre le web part sur un site donné doit disposer des droits de gestion de listes sur ce site (Propriétaire ou Membre avec droits de conception) : c'est elle qui déclenche la création automatique des listes.</w:t>
+      </w:r>
+    </w:p>
+    <w:p>
+      <w:pPr>
+        <w:pStyle w:val="ListParagraph"/>
+        <w:numPr>
+          <w:ilvl w:val="0"/>
+          <w:numId w:val="2"/>
+        </w:numPr>
+        <w:spacing w:after="80"/>
+      </w:pPr>
+      <w:r>
+        <w:rPr>
+          <w:color w:val="000000"/>
+          <w:sz w:val="21"/>
+          <w:szCs w:val="21"/>
+        </w:rPr>
+        <w:t xml:space="preserve">Fonctionne dans le navigateur, sans aucune installation sur le poste de l'utilisateur.</w:t>
+      </w:r>
+    </w:p>
+    <w:p>
+      <w:pPr>
+        <w:pStyle w:val="Heading2"/>
+        <w:spacing w:after="160" w:before="360"/>
+      </w:pPr>
+      <w:r>
+        <w:rPr>
+          <w:b/>
+          <w:bCs/>
+          <w:color w:val="000000"/>
+          <w:sz w:val="26"/>
+          <w:szCs w:val="26"/>
+        </w:rPr>
+        <w:t xml:space="preserve">5.3. Commune aux deux modes</w:t>
+      </w:r>
+    </w:p>
+    <w:p>
+      <w:pPr>
+        <w:pStyle w:val="ListParagraph"/>
+        <w:numPr>
+          <w:ilvl w:val="0"/>
+          <w:numId w:val="2"/>
+        </w:numPr>
+        <w:spacing w:after="80"/>
+      </w:pPr>
+      <w:r>
+        <w:rPr>
+          <w:color w:val="000000"/>
+          <w:sz w:val="21"/>
+          <w:szCs w:val="21"/>
+        </w:rPr>
+        <w:t xml:space="preserve">Les fichiers de conditions commerciales doivent être au format .xlsx ; la reconnaissance des en-têtes tolère plusieurs onglets annexes et des en-têtes de colonnes étalés sur plusieurs lignes (voir spécifications techniques).</w:t>
+      </w:r>
+    </w:p>
+    <w:p>
+      <w:pPr>
+        <w:pStyle w:val="ListParagraph"/>
+        <w:numPr>
+          <w:ilvl w:val="0"/>
+          <w:numId w:val="2"/>
+        </w:numPr>
+        <w:spacing w:after="80"/>
+      </w:pPr>
+      <w:r>
+        <w:rPr>
+          <w:color w:val="000000"/>
+          <w:sz w:val="21"/>
+          <w:szCs w:val="21"/>
+        </w:rPr>
+        <w:t xml:space="preserve">Les templates de contrat doivent être au format .docx, avec les emplacements à remplir balisés {{Nom de variable}}.</w:t>
       </w:r>
     </w:p>
     <w:p>
@@ -3127,7 +3708,7 @@
                 <w:sz w:val="20"/>
                 <w:szCs w:val="20"/>
               </w:rPr>
-              <w:t xml:space="preserve">Guide utilisateur</w:t>
+              <w:t xml:space="preserve">Paquet SharePoint</w:t>
             </w:r>
           </w:p>
         </w:tc>
@@ -3153,7 +3734,7 @@
                 <w:sz w:val="20"/>
                 <w:szCs w:val="20"/>
               </w:rPr>
-              <w:t xml:space="preserve">Mode d'emploi à destination de l'équipe Achats (document séparé).</w:t>
+              <w:t xml:space="preserve">achats-contrats.sppkg, à déposer dans le catalogue d'applications du tenant.</w:t>
             </w:r>
           </w:p>
         </w:tc>
@@ -3182,7 +3763,7 @@
                 <w:sz w:val="20"/>
                 <w:szCs w:val="20"/>
               </w:rPr>
-              <w:t xml:space="preserve">Spécifications techniques</w:t>
+              <w:t xml:space="preserve">Guide utilisateur</w:t>
             </w:r>
           </w:p>
         </w:tc>
@@ -3209,6 +3790,60 @@
                 <w:sz w:val="20"/>
                 <w:szCs w:val="20"/>
               </w:rPr>
+              <w:t xml:space="preserve">Mode d'emploi à destination de l'équipe Achats, couvrant les deux modes d'accès (document séparé).</w:t>
+            </w:r>
+          </w:p>
+        </w:tc>
+      </w:tr>
+      <w:tr>
+        <w:tc>
+          <w:tcPr>
+            <w:tcW w:type="dxa" w:w="2600"/>
+            <w:tcMar>
+              <w:top w:type="dxa" w:w="80"/>
+              <w:left w:type="dxa" w:w="100"/>
+              <w:bottom w:type="dxa" w:w="80"/>
+              <w:right w:type="dxa" w:w="100"/>
+            </w:tcMar>
+          </w:tcPr>
+          <w:p>
+            <w:pPr>
+              <w:jc w:val="left"/>
+            </w:pPr>
+            <w:r>
+              <w:rPr>
+                <w:b w:val="false"/>
+                <w:bCs w:val="false"/>
+                <w:color w:val="000000"/>
+                <w:sz w:val="20"/>
+                <w:szCs w:val="20"/>
+              </w:rPr>
+              <w:t xml:space="preserve">Spécifications techniques</w:t>
+            </w:r>
+          </w:p>
+        </w:tc>
+        <w:tc>
+          <w:tcPr>
+            <w:tcW w:type="dxa" w:w="7400"/>
+            <w:tcMar>
+              <w:top w:type="dxa" w:w="80"/>
+              <w:left w:type="dxa" w:w="100"/>
+              <w:bottom w:type="dxa" w:w="80"/>
+              <w:right w:type="dxa" w:w="100"/>
+            </w:tcMar>
+          </w:tcPr>
+          <w:p>
+            <w:pPr>
+              <w:jc w:val="left"/>
+            </w:pPr>
+            <w:r>
+              <w:rPr>
+                <w:b w:val="false"/>
+                <w:bCs w:val="false"/>
+                <w:color w:val="000000"/>
+                <w:sz w:val="20"/>
+                <w:szCs w:val="20"/>
+              </w:rPr>
               <w:t xml:space="preserve">Description de l'architecture, du modèle de données et des algorithmes clés, à destination des mainteneurs (document séparé).</w:t>
             </w:r>
           </w:p>
@@ -3218,6 +3853,7 @@
         <w:tc>
           <w:tcPr>
             <w:tcW w:type="dxa" w:w="2600"/>
+            <w:shd w:fill="F5F6F8" w:val="clear"/>
             <w:tcMar>
               <w:top w:type="dxa" w:w="80"/>
               <w:left w:type="dxa" w:w="100"/>
@@ -3244,6 +3880,7 @@
         <w:tc>
           <w:tcPr>
             <w:tcW w:type="dxa" w:w="7400"/>
+            <w:shd w:fill="F5F6F8" w:val="clear"/>
             <w:tcMar>
               <w:top w:type="dxa" w:w="80"/>
               <w:left w:type="dxa" w:w="100"/>
@@ -3416,6 +4053,24 @@
     </w:p>
     <w:p>
       <w:pPr>
+        <w:pStyle w:val="ListParagraph"/>
+        <w:numPr>
+          <w:ilvl w:val="0"/>
+          <w:numId w:val="2"/>
+        </w:numPr>
+        <w:spacing w:after="80"/>
+      </w:pPr>
+      <w:r>
+        <w:rPr>
+          <w:color w:val="000000"/>
+          <w:sz w:val="21"/>
+          <w:szCs w:val="21"/>
+        </w:rPr>
+        <w:t xml:space="preserve">Le web part SharePoint, ajouté sur une page d'un site où il n'a jamais été utilisé, crée automatiquement les listes et bibliothèques nécessaires sans intervention manuelle, et affiche le même parcours en trois étapes que l'exécutable.</w:t>
+      </w:r>
+    </w:p>
+    <w:p>
+      <w:pPr>
         <w:pStyle w:val="Heading1"/>
         <w:pBdr>
           <w:bottom w:val="single" w:color="00874C" w:sz="8" w:space="4"/>
@@ -3430,7 +4085,212 @@
           <w:sz w:val="32"/>
           <w:szCs w:val="32"/>
         </w:rPr>
-        <w:t xml:space="preserve">8. Glossaire</w:t>
+        <w:t xml:space="preserve">8. Historique des versions du document</w:t>
+      </w:r>
+    </w:p>
+    <w:tbl>
+      <w:tblPr>
+        <w:tblW w:type="dxa" w:w="10000"/>
+        <w:tblBorders>
+          <w:top w:val="single" w:color="DDE1E6" w:sz="4"/>
+          <w:left w:val="single" w:color="DDE1E6" w:sz="4"/>
+          <w:bottom w:val="single" w:color="DDE1E6" w:sz="4"/>
+          <w:right w:val="single" w:color="DDE1E6" w:sz="4"/>
+          <w:insideH w:val="single" w:color="DDE1E6" w:sz="4"/>
+          <w:insideV w:val="single" w:color="DDE1E6" w:sz="4"/>
+        </w:tblBorders>
+      </w:tblPr>
+      <w:tblGrid>
+        <w:gridCol w:w="1600"/>
+        <w:gridCol w:w="8400"/>
+      </w:tblGrid>
+      <w:tr>
+        <w:trPr>
+          <w:tblHeader/>
+        </w:trPr>
+        <w:tc>
+          <w:tcPr>
+            <w:tcW w:type="dxa" w:w="1600"/>
+            <w:shd w:fill="00874C" w:val="clear"/>
+            <w:tcMar>
+              <w:top w:type="dxa" w:w="80"/>
+              <w:left w:type="dxa" w:w="100"/>
+              <w:bottom w:type="dxa" w:w="80"/>
+              <w:right w:type="dxa" w:w="100"/>
+            </w:tcMar>
+          </w:tcPr>
+          <w:p>
+            <w:pPr>
+              <w:jc w:val="left"/>
+            </w:pPr>
+            <w:r>
+              <w:rPr>
+                <w:b/>
+                <w:bCs/>
+                <w:color w:val="FFFFFF"/>
+                <w:sz w:val="20"/>
+                <w:szCs w:val="20"/>
+              </w:rPr>
+              <w:t xml:space="preserve">Version</w:t>
+            </w:r>
+          </w:p>
+        </w:tc>
+        <w:tc>
+          <w:tcPr>
+            <w:tcW w:type="dxa" w:w="8400"/>
+            <w:shd w:fill="00874C" w:val="clear"/>
+            <w:tcMar>
+              <w:top w:type="dxa" w:w="80"/>
+              <w:left w:type="dxa" w:w="100"/>
+              <w:bottom w:type="dxa" w:w="80"/>
+              <w:right w:type="dxa" w:w="100"/>
+            </w:tcMar>
+          </w:tcPr>
+          <w:p>
+            <w:pPr>
+              <w:jc w:val="left"/>
+            </w:pPr>
+            <w:r>
+              <w:rPr>
+                <w:b/>
+                <w:bCs/>
+                <w:color w:val="FFFFFF"/>
+                <w:sz w:val="20"/>
+                <w:szCs w:val="20"/>
+              </w:rPr>
+              <w:t xml:space="preserve">Contenu</w:t>
+            </w:r>
+          </w:p>
+        </w:tc>
+      </w:tr>
+      <w:tr>
+        <w:tc>
+          <w:tcPr>
+            <w:tcW w:type="dxa" w:w="1600"/>
+            <w:tcMar>
+              <w:top w:type="dxa" w:w="80"/>
+              <w:left w:type="dxa" w:w="100"/>
+              <w:bottom w:type="dxa" w:w="80"/>
+              <w:right w:type="dxa" w:w="100"/>
+            </w:tcMar>
+          </w:tcPr>
+          <w:p>
+            <w:pPr>
+              <w:jc w:val="left"/>
+            </w:pPr>
+            <w:r>
+              <w:rPr>
+                <w:b w:val="false"/>
+                <w:bCs w:val="false"/>
+                <w:color w:val="000000"/>
+                <w:sz w:val="20"/>
+                <w:szCs w:val="20"/>
+              </w:rPr>
+              <w:t xml:space="preserve">1.0</w:t>
+            </w:r>
+          </w:p>
+        </w:tc>
+        <w:tc>
+          <w:tcPr>
+            <w:tcW w:type="dxa" w:w="8400"/>
+            <w:tcMar>
+              <w:top w:type="dxa" w:w="80"/>
+              <w:left w:type="dxa" w:w="100"/>
+              <w:bottom w:type="dxa" w:w="80"/>
+              <w:right w:type="dxa" w:w="100"/>
+            </w:tcMar>
+          </w:tcPr>
+          <w:p>
+            <w:pPr>
+              <w:jc w:val="left"/>
+            </w:pPr>
+            <w:r>
+              <w:rPr>
+                <w:b w:val="false"/>
+                <w:bCs w:val="false"/>
+                <w:color w:val="000000"/>
+                <w:sz w:val="20"/>
+                <w:szCs w:val="20"/>
+              </w:rPr>
+              <w:t xml:space="preserve">Périmètre initial : application livrée sous forme d'exécutable Windows autonome uniquement.</w:t>
+            </w:r>
+          </w:p>
+        </w:tc>
+      </w:tr>
+      <w:tr>
+        <w:tc>
+          <w:tcPr>
+            <w:tcW w:type="dxa" w:w="1600"/>
+            <w:shd w:fill="F5F6F8" w:val="clear"/>
+            <w:tcMar>
+              <w:top w:type="dxa" w:w="80"/>
+              <w:left w:type="dxa" w:w="100"/>
+              <w:bottom w:type="dxa" w:w="80"/>
+              <w:right w:type="dxa" w:w="100"/>
+            </w:tcMar>
+          </w:tcPr>
+          <w:p>
+            <w:pPr>
+              <w:jc w:val="left"/>
+            </w:pPr>
+            <w:r>
+              <w:rPr>
+                <w:b w:val="false"/>
+                <w:bCs w:val="false"/>
+                <w:color w:val="000000"/>
+                <w:sz w:val="20"/>
+                <w:szCs w:val="20"/>
+              </w:rPr>
+              <w:t xml:space="preserve">2.0</w:t>
+            </w:r>
+          </w:p>
+        </w:tc>
+        <w:tc>
+          <w:tcPr>
+            <w:tcW w:type="dxa" w:w="8400"/>
+            <w:shd w:fill="F5F6F8" w:val="clear"/>
+            <w:tcMar>
+              <w:top w:type="dxa" w:w="80"/>
+              <w:left w:type="dxa" w:w="100"/>
+              <w:bottom w:type="dxa" w:w="80"/>
+              <w:right w:type="dxa" w:w="100"/>
+            </w:tcMar>
+          </w:tcPr>
+          <w:p>
+            <w:pPr>
+              <w:jc w:val="left"/>
+            </w:pPr>
+            <w:r>
+              <w:rPr>
+                <w:b w:val="false"/>
+                <w:bCs w:val="false"/>
+                <w:color w:val="000000"/>
+                <w:sz w:val="20"/>
+                <w:szCs w:val="20"/>
+              </w:rPr>
+              <w:t xml:space="preserve">Ajout du mode de déploiement SharePoint Online (web part SPFx) ; mise à jour des contraintes (parsing Excel multi-onglets/multi-lignes d'en-tête) et des exigences non fonctionnelles (sécurité réseau, auto-provisionnement).</w:t>
+            </w:r>
+          </w:p>
+        </w:tc>
+      </w:tr>
+    </w:tbl>
+    <w:p>
+      <w:pPr>
+        <w:pStyle w:val="Heading1"/>
+        <w:pBdr>
+          <w:bottom w:val="single" w:color="00874C" w:sz="8" w:space="4"/>
+        </w:pBdr>
+        <w:spacing w:after="240" w:before="480"/>
+      </w:pPr>
+      <w:r>
+        <w:rPr>
+          <w:b/>
+          <w:bCs/>
+          <w:color w:val="00874C"/>
+          <w:sz w:val="32"/>
+          <w:szCs w:val="32"/>
+        </w:rPr>
+        <w:t xml:space="preserve">9. Glossaire</w:t>
       </w:r>
     </w:p>
     <w:tbl>

</xml_diff>